<commit_message>
Update resume title to reflect current role as Full Stack & Embedded Systems Engineer
</commit_message>
<xml_diff>
--- a/public/resume/Ezz_Nasr_Resume.docx
+++ b/public/resume/Ezz_Nasr_Resume.docx
@@ -28,7 +28,14 @@
           <w:rFonts w:ascii="Calibri" w:eastAsia="Calibri" w:hAnsi="Calibri" w:cs="Calibri"/>
           <w:color w:val="333333"/>
         </w:rPr>
-        <w:t>Backend Engineer | Computer Engineering Student | Full Stack &amp; Embedded Systems</w:t>
+        <w:t>Full Stack &amp; Embedded Systems</w:t>
+      </w:r>
+      <w:r>
+        <w:rPr>
+          <w:rFonts w:ascii="Calibri" w:eastAsia="Calibri" w:hAnsi="Calibri" w:cs="Calibri"/>
+          <w:color w:val="333333"/>
+        </w:rPr>
+        <w:t xml:space="preserve"> Engineer</w:t>
       </w:r>
     </w:p>
     <w:p>
@@ -42,7 +49,43 @@
           <w:sz w:val="19"/>
           <w:szCs w:val="19"/>
         </w:rPr>
-        <w:t xml:space="preserve">Alexandria, Egypt  |  ezznasrone@gmail.com  |  </w:t>
+        <w:t xml:space="preserve">Alexandria, </w:t>
+      </w:r>
+      <w:proofErr w:type="gramStart"/>
+      <w:r>
+        <w:rPr>
+          <w:rFonts w:ascii="Calibri" w:eastAsia="Calibri" w:hAnsi="Calibri" w:cs="Calibri"/>
+          <w:sz w:val="19"/>
+          <w:szCs w:val="19"/>
+        </w:rPr>
+        <w:t>Egypt  |</w:t>
+      </w:r>
+      <w:proofErr w:type="gramEnd"/>
+      <w:r>
+        <w:rPr>
+          <w:rFonts w:ascii="Calibri" w:eastAsia="Calibri" w:hAnsi="Calibri" w:cs="Calibri"/>
+          <w:sz w:val="19"/>
+          <w:szCs w:val="19"/>
+        </w:rPr>
+        <w:t xml:space="preserve">  </w:t>
+      </w:r>
+      <w:proofErr w:type="gramStart"/>
+      <w:r>
+        <w:rPr>
+          <w:rFonts w:ascii="Calibri" w:eastAsia="Calibri" w:hAnsi="Calibri" w:cs="Calibri"/>
+          <w:sz w:val="19"/>
+          <w:szCs w:val="19"/>
+        </w:rPr>
+        <w:t>ezznasrone@gmail.com  |</w:t>
+      </w:r>
+      <w:proofErr w:type="gramEnd"/>
+      <w:r>
+        <w:rPr>
+          <w:rFonts w:ascii="Calibri" w:eastAsia="Calibri" w:hAnsi="Calibri" w:cs="Calibri"/>
+          <w:sz w:val="19"/>
+          <w:szCs w:val="19"/>
+        </w:rPr>
+        <w:t xml:space="preserve">  </w:t>
       </w:r>
       <w:hyperlink r:id="rId5" w:history="1">
         <w:r>
@@ -139,7 +182,25 @@
           <w:sz w:val="19"/>
           <w:szCs w:val="19"/>
         </w:rPr>
-        <w:t>Third-year Computer Engineering student (Computer Communications and Artificial Intelligence, Alexandria University) specializing in Backend Engineering, with working knowledge of Full Stack Development, Embedded Systems, System Design, Databases, and APIs. Designed and shipped a production ERP system currently used by a 20-employee manufacturing company. Builds API-first, modular backend systems (FastAPI, REST, SQL) paired with React frontends, and extends the same systems-thinking approach into embedded hardware. Preparing for AWS Certified Cloud Practitioner and training on the ICPC competitive programming track.</w:t>
+        <w:t xml:space="preserve">Third-year Computer Engineering student (Computer Communications and Artificial Intelligence, Alexandria University) specializing in Backend Engineering, with working knowledge of Full Stack Development, Embedded Systems, System Design, Databases, and APIs. Designed and shipped a production ERP system currently used by a 20-employee manufacturing company. Builds API-first, modular backend systems (FastAPI, REST, SQL) paired with React frontends, and extends the same </w:t>
+      </w:r>
+      <w:proofErr w:type="gramStart"/>
+      <w:r>
+        <w:rPr>
+          <w:rFonts w:ascii="Calibri" w:eastAsia="Calibri" w:hAnsi="Calibri" w:cs="Calibri"/>
+          <w:sz w:val="19"/>
+          <w:szCs w:val="19"/>
+        </w:rPr>
+        <w:t>systems</w:t>
+      </w:r>
+      <w:proofErr w:type="gramEnd"/>
+      <w:r>
+        <w:rPr>
+          <w:rFonts w:ascii="Calibri" w:eastAsia="Calibri" w:hAnsi="Calibri" w:cs="Calibri"/>
+          <w:sz w:val="19"/>
+          <w:szCs w:val="19"/>
+        </w:rPr>
+        <w:t>-thinking approach into embedded hardware. Preparing for AWS Certified Cloud Practitioner and training on the ICPC competitive programming track.</w:t>
       </w:r>
     </w:p>
     <w:p>
@@ -1412,6 +1473,7 @@
   <w:style w:type="character" w:default="1" w:styleId="DefaultParagraphFont">
     <w:name w:val="Default Paragraph Font"/>
     <w:uiPriority w:val="1"/>
+    <w:semiHidden/>
     <w:unhideWhenUsed/>
   </w:style>
   <w:style w:type="table" w:default="1" w:styleId="TableNormal">

</xml_diff>

<commit_message>
Update resume PDF and DOCX files with additional contact information and project details
</commit_message>
<xml_diff>
--- a/public/resume/Ezz_Nasr_Resume.docx
+++ b/public/resume/Ezz_Nasr_Resume.docx
@@ -49,43 +49,7 @@
           <w:sz w:val="19"/>
           <w:szCs w:val="19"/>
         </w:rPr>
-        <w:t xml:space="preserve">Alexandria, </w:t>
-      </w:r>
-      <w:proofErr w:type="gramStart"/>
-      <w:r>
-        <w:rPr>
-          <w:rFonts w:ascii="Calibri" w:eastAsia="Calibri" w:hAnsi="Calibri" w:cs="Calibri"/>
-          <w:sz w:val="19"/>
-          <w:szCs w:val="19"/>
-        </w:rPr>
-        <w:t>Egypt  |</w:t>
-      </w:r>
-      <w:proofErr w:type="gramEnd"/>
-      <w:r>
-        <w:rPr>
-          <w:rFonts w:ascii="Calibri" w:eastAsia="Calibri" w:hAnsi="Calibri" w:cs="Calibri"/>
-          <w:sz w:val="19"/>
-          <w:szCs w:val="19"/>
-        </w:rPr>
-        <w:t xml:space="preserve">  </w:t>
-      </w:r>
-      <w:proofErr w:type="gramStart"/>
-      <w:r>
-        <w:rPr>
-          <w:rFonts w:ascii="Calibri" w:eastAsia="Calibri" w:hAnsi="Calibri" w:cs="Calibri"/>
-          <w:sz w:val="19"/>
-          <w:szCs w:val="19"/>
-        </w:rPr>
-        <w:t>ezznasrone@gmail.com  |</w:t>
-      </w:r>
-      <w:proofErr w:type="gramEnd"/>
-      <w:r>
-        <w:rPr>
-          <w:rFonts w:ascii="Calibri" w:eastAsia="Calibri" w:hAnsi="Calibri" w:cs="Calibri"/>
-          <w:sz w:val="19"/>
-          <w:szCs w:val="19"/>
-        </w:rPr>
-        <w:t xml:space="preserve">  </w:t>
+        <w:t xml:space="preserve">Alexandria, Egypt  |  ezznasrone@gmail.com  |  </w:t>
       </w:r>
       <w:hyperlink r:id="rId5" w:history="1">
         <w:r>
@@ -152,6 +116,9 @@
       <w:r>
         <w:t xml:space="preserve"> </w:t>
       </w:r>
+      <w:r>
+        <w:t>| +201065194613</w:t>
+      </w:r>
     </w:p>
     <w:p>
       <w:pPr>
@@ -182,25 +149,7 @@
           <w:sz w:val="19"/>
           <w:szCs w:val="19"/>
         </w:rPr>
-        <w:t xml:space="preserve">Third-year Computer Engineering student (Computer Communications and Artificial Intelligence, Alexandria University) specializing in Backend Engineering, with working knowledge of Full Stack Development, Embedded Systems, System Design, Databases, and APIs. Designed and shipped a production ERP system currently used by a 20-employee manufacturing company. Builds API-first, modular backend systems (FastAPI, REST, SQL) paired with React frontends, and extends the same </w:t>
-      </w:r>
-      <w:proofErr w:type="gramStart"/>
-      <w:r>
-        <w:rPr>
-          <w:rFonts w:ascii="Calibri" w:eastAsia="Calibri" w:hAnsi="Calibri" w:cs="Calibri"/>
-          <w:sz w:val="19"/>
-          <w:szCs w:val="19"/>
-        </w:rPr>
-        <w:t>systems</w:t>
-      </w:r>
-      <w:proofErr w:type="gramEnd"/>
-      <w:r>
-        <w:rPr>
-          <w:rFonts w:ascii="Calibri" w:eastAsia="Calibri" w:hAnsi="Calibri" w:cs="Calibri"/>
-          <w:sz w:val="19"/>
-          <w:szCs w:val="19"/>
-        </w:rPr>
-        <w:t>-thinking approach into embedded hardware. Preparing for AWS Certified Cloud Practitioner and training on the ICPC competitive programming track.</w:t>
+        <w:t>Third-year Computer Engineering student (Computer Communications and Artificial Intelligence, Alexandria University) specializing in Backend Engineering, with working knowledge of Full Stack Development, Embedded Systems, System Design, Databases, and APIs. Designed and shipped a production ERP system currently used by a 20-employee manufacturing company. Builds API-first, modular backend systems (FastAPI, REST, SQL) paired with React frontends, and extends the same systems-thinking approach into embedded hardware. Preparing for AWS Certified Cloud Practitioner and training on the ICPC competitive programming track.</w:t>
       </w:r>
     </w:p>
     <w:p>
@@ -388,14 +337,59 @@
           <w:numId w:val="1"/>
         </w:numPr>
         <w:spacing w:after="30"/>
-      </w:pPr>
-      <w:r>
-        <w:rPr>
-          <w:rFonts w:ascii="Calibri" w:eastAsia="Calibri" w:hAnsi="Calibri" w:cs="Calibri"/>
-          <w:sz w:val="19"/>
-          <w:szCs w:val="19"/>
-        </w:rPr>
-        <w:t>Designed and built a full enterprise resource planning system covering customer, supplier, and inventory management, order tracking, invoice generation, and financial reporting</w:t>
+        <w:rPr>
+          <w:rFonts w:ascii="Calibri" w:eastAsia="Calibri" w:hAnsi="Calibri" w:cs="Calibri"/>
+          <w:sz w:val="19"/>
+          <w:szCs w:val="19"/>
+        </w:rPr>
+      </w:pPr>
+      <w:r>
+        <w:rPr>
+          <w:rFonts w:ascii="Calibri" w:eastAsia="Calibri" w:hAnsi="Calibri" w:cs="Calibri"/>
+          <w:sz w:val="19"/>
+          <w:szCs w:val="19"/>
+        </w:rPr>
+        <w:t xml:space="preserve">Designed and </w:t>
+      </w:r>
+      <w:r>
+        <w:rPr>
+          <w:rFonts w:ascii="Calibri" w:eastAsia="Calibri" w:hAnsi="Calibri" w:cs="Calibri"/>
+          <w:sz w:val="19"/>
+          <w:szCs w:val="19"/>
+        </w:rPr>
+        <w:t>Developed</w:t>
+      </w:r>
+      <w:r>
+        <w:rPr>
+          <w:rFonts w:ascii="Calibri" w:eastAsia="Calibri" w:hAnsi="Calibri" w:cs="Calibri"/>
+          <w:sz w:val="19"/>
+          <w:szCs w:val="19"/>
+        </w:rPr>
+        <w:t xml:space="preserve"> </w:t>
+      </w:r>
+      <w:r>
+        <w:rPr>
+          <w:rFonts w:ascii="Calibri" w:eastAsia="Calibri" w:hAnsi="Calibri" w:cs="Calibri"/>
+          <w:sz w:val="19"/>
+          <w:szCs w:val="19"/>
+        </w:rPr>
+        <w:t xml:space="preserve">a full enterprise resource planning </w:t>
+      </w:r>
+      <w:r>
+        <w:rPr>
+          <w:rFonts w:ascii="Calibri" w:eastAsia="Calibri" w:hAnsi="Calibri" w:cs="Calibri"/>
+          <w:sz w:val="19"/>
+          <w:szCs w:val="19"/>
+        </w:rPr>
+        <w:t xml:space="preserve">System </w:t>
+      </w:r>
+      <w:r>
+        <w:rPr>
+          <w:rFonts w:ascii="Calibri" w:eastAsia="Calibri" w:hAnsi="Calibri" w:cs="Calibri"/>
+          <w:sz w:val="19"/>
+          <w:szCs w:val="19"/>
+        </w:rPr>
+        <w:t>spanning 6 core modules (customer, supplier, inventory, order tracking, invoicing, financial reporting</w:t>
       </w:r>
     </w:p>
     <w:p>
@@ -415,6 +409,22 @@
         </w:rPr>
         <w:t>Architected a modular, service-based backend (React → FastAPI → SQLite → PDF Generator) with a thin-route, strong-business-logic design pattern</w:t>
       </w:r>
+      <w:r>
+        <w:rPr>
+          <w:rFonts w:ascii="Calibri" w:eastAsia="Calibri" w:hAnsi="Calibri" w:cs="Calibri"/>
+          <w:sz w:val="19"/>
+          <w:szCs w:val="19"/>
+        </w:rPr>
+        <w:t xml:space="preserve"> 15</w:t>
+      </w:r>
+      <w:r>
+        <w:rPr>
+          <w:rFonts w:ascii="Calibri" w:eastAsia="Calibri" w:hAnsi="Calibri" w:cs="Calibri"/>
+          <w:sz w:val="19"/>
+          <w:szCs w:val="19"/>
+        </w:rPr>
+        <w:t>+ REST endpoints across 5 service modules</w:t>
+      </w:r>
     </w:p>
     <w:p>
       <w:pPr>
@@ -431,7 +441,15 @@
           <w:sz w:val="19"/>
           <w:szCs w:val="19"/>
         </w:rPr>
-        <w:t>Delivered employee management, cost analysis, store credit, customer balances, and payment tracking features</w:t>
+        <w:t xml:space="preserve">Delivered employee management, cost analysis, store credit, customer balances, </w:t>
+      </w:r>
+      <w:r>
+        <w:rPr>
+          <w:rFonts w:ascii="Calibri" w:eastAsia="Calibri" w:hAnsi="Calibri" w:cs="Calibri"/>
+          <w:sz w:val="19"/>
+          <w:szCs w:val="19"/>
+        </w:rPr>
+        <w:t>supporting payroll and cost tracking for the business's full 20-person staff.</w:t>
       </w:r>
     </w:p>
     <w:p>
@@ -449,7 +467,23 @@
           <w:sz w:val="19"/>
           <w:szCs w:val="19"/>
         </w:rPr>
-        <w:t>System is feature-complete and in active daily use by the client company, replacing manual spreadsheet-based operations</w:t>
+        <w:t>System is in active daily use by the client company, replacing manual spreadsheet-based operations</w:t>
+      </w:r>
+      <w:r>
+        <w:rPr>
+          <w:rFonts w:ascii="Calibri" w:eastAsia="Calibri" w:hAnsi="Calibri" w:cs="Calibri"/>
+          <w:sz w:val="19"/>
+          <w:szCs w:val="19"/>
+        </w:rPr>
+        <w:t xml:space="preserve"> </w:t>
+      </w:r>
+      <w:r>
+        <w:rPr>
+          <w:rFonts w:ascii="Calibri" w:eastAsia="Calibri" w:hAnsi="Calibri" w:cs="Calibri"/>
+          <w:sz w:val="19"/>
+          <w:szCs w:val="19"/>
+        </w:rPr>
+        <w:t>processing 200+ invoices to date</w:t>
       </w:r>
     </w:p>
     <w:p>
@@ -512,7 +546,55 @@
           <w:sz w:val="19"/>
           <w:szCs w:val="19"/>
         </w:rPr>
-        <w:t>Built a three-generation invoice management system, evolving from a command-line tool to a desktop GUI to a full React + FastAPI web application</w:t>
+        <w:t>Engineered a three-generation invoice management system, evolving from a command-line tool to a desktop GUI to a full React + FastAPI web application</w:t>
+      </w:r>
+      <w:r>
+        <w:rPr>
+          <w:rFonts w:ascii="Calibri" w:eastAsia="Calibri" w:hAnsi="Calibri" w:cs="Calibri"/>
+          <w:sz w:val="19"/>
+          <w:szCs w:val="19"/>
+        </w:rPr>
+        <w:t xml:space="preserve"> with </w:t>
+      </w:r>
+      <w:r>
+        <w:rPr>
+          <w:rFonts w:ascii="Calibri" w:eastAsia="Calibri" w:hAnsi="Calibri" w:cs="Calibri"/>
+          <w:sz w:val="19"/>
+          <w:szCs w:val="19"/>
+        </w:rPr>
+        <w:t>97</w:t>
+      </w:r>
+      <w:r>
+        <w:rPr>
+          <w:rFonts w:ascii="Calibri" w:eastAsia="Calibri" w:hAnsi="Calibri" w:cs="Calibri"/>
+          <w:sz w:val="19"/>
+          <w:szCs w:val="19"/>
+        </w:rPr>
+        <w:t>+</w:t>
+      </w:r>
+      <w:r>
+        <w:rPr>
+          <w:rFonts w:ascii="Calibri" w:eastAsia="Calibri" w:hAnsi="Calibri" w:cs="Calibri"/>
+          <w:sz w:val="19"/>
+          <w:szCs w:val="19"/>
+        </w:rPr>
+        <w:t xml:space="preserve"> commits across </w:t>
+      </w:r>
+      <w:r>
+        <w:rPr>
+          <w:rFonts w:ascii="Calibri" w:eastAsia="Calibri" w:hAnsi="Calibri" w:cs="Calibri"/>
+          <w:sz w:val="19"/>
+          <w:szCs w:val="19"/>
+        </w:rPr>
+        <w:t xml:space="preserve">the </w:t>
+      </w:r>
+      <w:r>
+        <w:rPr>
+          <w:rFonts w:ascii="Calibri" w:eastAsia="Calibri" w:hAnsi="Calibri" w:cs="Calibri"/>
+          <w:sz w:val="19"/>
+          <w:szCs w:val="19"/>
+        </w:rPr>
+        <w:t>three architectural generations</w:t>
       </w:r>
     </w:p>
     <w:p>
@@ -530,7 +612,79 @@
           <w:sz w:val="19"/>
           <w:szCs w:val="19"/>
         </w:rPr>
-        <w:t>Implemented customer and product databases, retail/wholesale pricing, discount and tax logic, profit calculations, and invoice history</w:t>
+        <w:t xml:space="preserve">Implemented </w:t>
+      </w:r>
+      <w:r>
+        <w:rPr>
+          <w:rFonts w:ascii="Calibri" w:eastAsia="Calibri" w:hAnsi="Calibri" w:cs="Calibri"/>
+          <w:sz w:val="19"/>
+          <w:szCs w:val="19"/>
+        </w:rPr>
+        <w:t>4 Table relational Schema (</w:t>
+      </w:r>
+      <w:r>
+        <w:rPr>
+          <w:rFonts w:ascii="Calibri" w:eastAsia="Calibri" w:hAnsi="Calibri" w:cs="Calibri"/>
+          <w:sz w:val="19"/>
+          <w:szCs w:val="19"/>
+        </w:rPr>
+        <w:t>customer</w:t>
+      </w:r>
+      <w:r>
+        <w:rPr>
+          <w:rFonts w:ascii="Calibri" w:eastAsia="Calibri" w:hAnsi="Calibri" w:cs="Calibri"/>
+          <w:sz w:val="19"/>
+          <w:szCs w:val="19"/>
+        </w:rPr>
+        <w:t>,</w:t>
+      </w:r>
+      <w:r>
+        <w:rPr>
+          <w:rFonts w:ascii="Calibri" w:eastAsia="Calibri" w:hAnsi="Calibri" w:cs="Calibri"/>
+          <w:sz w:val="19"/>
+          <w:szCs w:val="19"/>
+        </w:rPr>
+        <w:t xml:space="preserve"> product</w:t>
+      </w:r>
+      <w:r>
+        <w:rPr>
+          <w:rFonts w:ascii="Calibri" w:eastAsia="Calibri" w:hAnsi="Calibri" w:cs="Calibri"/>
+          <w:sz w:val="19"/>
+          <w:szCs w:val="19"/>
+        </w:rPr>
+        <w:t>s</w:t>
+      </w:r>
+      <w:r>
+        <w:rPr>
+          <w:rFonts w:ascii="Calibri" w:eastAsia="Calibri" w:hAnsi="Calibri" w:cs="Calibri"/>
+          <w:sz w:val="19"/>
+          <w:szCs w:val="19"/>
+        </w:rPr>
+        <w:t xml:space="preserve">, </w:t>
+      </w:r>
+      <w:r>
+        <w:rPr>
+          <w:rFonts w:ascii="Calibri" w:eastAsia="Calibri" w:hAnsi="Calibri" w:cs="Calibri"/>
+          <w:sz w:val="19"/>
+          <w:szCs w:val="19"/>
+        </w:rPr>
+        <w:t xml:space="preserve">order, order Details ) + </w:t>
+      </w:r>
+      <w:r>
+        <w:rPr>
+          <w:rFonts w:ascii="Calibri" w:eastAsia="Calibri" w:hAnsi="Calibri" w:cs="Calibri"/>
+          <w:sz w:val="19"/>
+          <w:szCs w:val="19"/>
+        </w:rPr>
+        <w:t>tax logic, profit calculations, and invoice history</w:t>
+      </w:r>
+      <w:r>
+        <w:rPr>
+          <w:rFonts w:ascii="Calibri" w:eastAsia="Calibri" w:hAnsi="Calibri" w:cs="Calibri"/>
+          <w:sz w:val="19"/>
+          <w:szCs w:val="19"/>
+        </w:rPr>
+        <w:t xml:space="preserve"> </w:t>
       </w:r>
     </w:p>
     <w:p>
@@ -566,7 +720,39 @@
           <w:sz w:val="19"/>
           <w:szCs w:val="19"/>
         </w:rPr>
-        <w:t>Applied lessons in frontend/backend separation, API design, state management, and packaging desktop software</w:t>
+        <w:t xml:space="preserve">Applied lessons in frontend/backend separation, API design, state management, and </w:t>
+      </w:r>
+      <w:r>
+        <w:rPr>
+          <w:rFonts w:ascii="Calibri" w:eastAsia="Calibri" w:hAnsi="Calibri" w:cs="Calibri"/>
+          <w:sz w:val="19"/>
+          <w:szCs w:val="19"/>
+        </w:rPr>
+        <w:t xml:space="preserve">packaged as a standalone </w:t>
+      </w:r>
+      <w:r>
+        <w:rPr>
+          <w:rFonts w:ascii="Calibri" w:eastAsia="Calibri" w:hAnsi="Calibri" w:cs="Calibri"/>
+          <w:sz w:val="19"/>
+          <w:szCs w:val="19"/>
+        </w:rPr>
+        <w:t>~</w:t>
+      </w:r>
+      <w:r>
+        <w:rPr>
+          <w:rFonts w:ascii="Calibri" w:eastAsia="Calibri" w:hAnsi="Calibri" w:cs="Calibri"/>
+          <w:sz w:val="19"/>
+          <w:szCs w:val="19"/>
+        </w:rPr>
+        <w:t xml:space="preserve">500MB Windows </w:t>
+      </w:r>
+      <w:r>
+        <w:rPr>
+          <w:rFonts w:ascii="Calibri" w:eastAsia="Calibri" w:hAnsi="Calibri" w:cs="Calibri"/>
+          <w:sz w:val="19"/>
+          <w:szCs w:val="19"/>
+        </w:rPr>
+        <w:t>exe</w:t>
       </w:r>
     </w:p>
     <w:p>

</xml_diff>

<commit_message>
Update resume to correct minor grammatical error in summary section
</commit_message>
<xml_diff>
--- a/public/resume/Ezz_Nasr_Resume.docx
+++ b/public/resume/Ezz_Nasr_Resume.docx
@@ -149,7 +149,23 @@
           <w:sz w:val="19"/>
           <w:szCs w:val="19"/>
         </w:rPr>
-        <w:t>Third-year Computer Engineering student (Computer Communications and Artificial Intelligence, Alexandria University) specializing in Backend Engineering, with working knowledge of Full Stack Development, Embedded Systems, System Design, Databases, and APIs. Designed and shipped a production ERP system currently used by a 20-employee manufacturing company. Builds API-first, modular backend systems (FastAPI, REST, SQL) paired with React frontends, and extends the same systems-thinking approach into embedded hardware. Preparing for AWS Certified Cloud Practitioner and training on the ICPC competitive programming track.</w:t>
+        <w:t xml:space="preserve">Third-year Computer Engineering student (Computer Communications and Artificial Intelligence, Alexandria University) specializing in Backend Engineering, with working knowledge of Full Stack Development, Embedded Systems, System Design, Databases, and APIs. Designed and shipped a production ERP system currently used by a 20-employee manufacturing company. Builds API-first, modular backend systems (FastAPI, REST, SQL) paired with React frontends, and extends the same </w:t>
+      </w:r>
+      <w:r>
+        <w:rPr>
+          <w:rFonts w:ascii="Calibri" w:eastAsia="Calibri" w:hAnsi="Calibri" w:cs="Calibri"/>
+          <w:sz w:val="19"/>
+          <w:szCs w:val="19"/>
+        </w:rPr>
+        <w:t>system</w:t>
+      </w:r>
+      <w:r>
+        <w:rPr>
+          <w:rFonts w:ascii="Calibri" w:eastAsia="Calibri" w:hAnsi="Calibri" w:cs="Calibri"/>
+          <w:sz w:val="19"/>
+          <w:szCs w:val="19"/>
+        </w:rPr>
+        <w:t>-thinking approach into embedded hardware. Preparing for AWS Certified Cloud Practitioner and training on the ICPC competitive programming track.</w:t>
       </w:r>
     </w:p>
     <w:p>

</xml_diff>